<commit_message>
Add client and team KYC registration summaries to the dashboard
Integrate new API endpoints for team KYC and team member data, and display these summaries alongside existing client KYC data on the admin dashboard in `kyc-admin.tsx`.

Replit-Commit-Author: Agent
Replit-Commit-Session-Id: 359075c4-f6cc-4727-990b-acbaafad0c22
Replit-Commit-Checkpoint-Type: full_checkpoint
Replit-Commit-Event-Id: 5d88059e-f9e7-4722-864f-d6f92083d289
Replit-Commit-Screenshot-Url: https://storage.googleapis.com/screenshot-production-us-central1/efc895ca-161b-43cb-8555-2a7825ee93b6/359075c4-f6cc-4727-990b-acbaafad0c22/cB3ExdB
Replit-Helium-Checkpoint-Created: true
</commit_message>
<xml_diff>
--- a/generated_docs/c395247f-93c7-4400-ad6a-205c6569c4be.docx
+++ b/generated_docs/c395247f-93c7-4400-ad6a-205c6569c4be.docx
@@ -2613,6 +2613,113 @@
           <w:szCs w:val="20"/>
         </w:rPr>
         <w:t xml:space="preserve">Stamp:</w:t>
+      </w:r>
+    </w:p>
+    <w:p>
+      <w:pPr>
+        <w:spacing w:before="400"/>
+      </w:pPr>
+    </w:p>
+    <w:p>
+      <w:pPr>
+        <w:pBdr>
+          <w:bottom w:val="single" w:color="333333" w:sz="2"/>
+        </w:pBdr>
+        <w:spacing w:after="200"/>
+        <w:jc w:val="center"/>
+      </w:pPr>
+      <w:r>
+        <w:rPr>
+          <w:rFonts w:ascii="Calibri" w:cs="Calibri" w:eastAsia="Calibri" w:hAnsi="Calibri"/>
+          <w:b/>
+          <w:bCs/>
+          <w:sz w:val="22"/>
+          <w:szCs w:val="22"/>
+        </w:rPr>
+        <w:t xml:space="preserve">DIGITAL SIGNATURE</w:t>
+      </w:r>
+    </w:p>
+    <w:p>
+      <w:pPr>
+        <w:spacing w:after="100"/>
+      </w:pPr>
+      <w:r>
+        <w:rPr>
+          <w:rFonts w:ascii="Calibri" w:cs="Calibri" w:eastAsia="Calibri" w:hAnsi="Calibri"/>
+          <w:b/>
+          <w:bCs/>
+          <w:sz w:val="18"/>
+          <w:szCs w:val="18"/>
+        </w:rPr>
+        <w:t xml:space="preserve">FOR &amp; ON BEHALF OF BUYER / ISSUER</w:t>
+      </w:r>
+    </w:p>
+    <w:p>
+      <w:pPr>
+        <w:spacing w:after="60"/>
+      </w:pPr>
+      <w:r>
+        <w:drawing>
+          <wp:inline distT="0" distB="0" distL="0" distR="0">
+            <wp:extent cx="1714500" cy="666750"/>
+            <wp:effectExtent t="0" r="0" b="0" l="0"/>
+            <wp:docPr id="1" name="" descr="" title=""/>
+            <wp:cNvGraphicFramePr>
+              <a:graphicFrameLocks xmlns:a="http://schemas.openxmlformats.org/drawingml/2006/main" noChangeAspect="1"/>
+            </wp:cNvGraphicFramePr>
+            <a:graphic xmlns:a="http://schemas.openxmlformats.org/drawingml/2006/main">
+              <a:graphicData uri="http://schemas.openxmlformats.org/drawingml/2006/picture">
+                <pic:pic xmlns:pic="http://schemas.openxmlformats.org/drawingml/2006/picture">
+                  <pic:nvPicPr>
+                    <pic:cNvPr id="0" name="" descr=""/>
+                    <pic:cNvPicPr>
+                      <a:picLocks noChangeAspect="1" noChangeArrowheads="1"/>
+                    </pic:cNvPicPr>
+                  </pic:nvPicPr>
+                  <pic:blipFill>
+                    <a:blip r:embed="rId7" cstate="none"/>
+                    <a:srcRect/>
+                    <a:stretch>
+                      <a:fillRect/>
+                    </a:stretch>
+                  </pic:blipFill>
+                  <pic:spPr bwMode="auto">
+                    <a:xfrm>
+                      <a:off x="0" y="0"/>
+                      <a:ext cx="1714500" cy="666750"/>
+                    </a:xfrm>
+                    <a:prstGeom prst="rect">
+                      <a:avLst/>
+                    </a:prstGeom>
+                  </pic:spPr>
+                </pic:pic>
+              </a:graphicData>
+            </a:graphic>
+          </wp:inline>
+        </w:drawing>
+      </w:r>
+    </w:p>
+    <w:p>
+      <w:pPr>
+        <w:spacing w:after="40"/>
+      </w:pPr>
+      <w:r>
+        <w:rPr>
+          <w:rFonts w:ascii="Calibri" w:cs="Calibri" w:eastAsia="Calibri" w:hAnsi="Calibri"/>
+          <w:sz w:val="18"/>
+          <w:szCs w:val="18"/>
+        </w:rPr>
+        <w:t xml:space="preserve">Name: VK</w:t>
+      </w:r>
+    </w:p>
+    <w:p>
+      <w:r>
+        <w:rPr>
+          <w:rFonts w:ascii="Calibri" w:cs="Calibri" w:eastAsia="Calibri" w:hAnsi="Calibri"/>
+          <w:sz w:val="18"/>
+          <w:szCs w:val="18"/>
+        </w:rPr>
+        <w:t xml:space="preserve">Date: 07 May 2026</w:t>
       </w:r>
     </w:p>
     <w:p>

</xml_diff>